<commit_message>
data: merge Tribly into Pedalons project
</commit_message>
<xml_diff>
--- a/docs/downloads/Gabriel_Landais_CV_FR.docx
+++ b/docs/downloads/Gabriel_Landais_CV_FR.docx
@@ -1159,36 +1159,6 @@
           <w:b/>
           <w:sz w:val="22"/>
         </w:rPr>
-        <w:t>Tribly</w:t>
-      </w:r>
-    </w:p>
-    <w:p>
-      <w:r>
-        <w:rPr>
-          <w:rFonts w:ascii="Calibri" w:hAnsi="Calibri"/>
-          <w:b w:val="0"/>
-          <w:sz w:val="22"/>
-        </w:rPr>
-        <w:t>Plateforme SaaS multi-tenant pour la gestion de clubs cyclistes (inscriptions, résultats, planning)</w:t>
-      </w:r>
-    </w:p>
-    <w:p>
-      <w:r>
-        <w:rPr>
-          <w:rFonts w:ascii="Calibri" w:hAnsi="Calibri"/>
-          <w:b w:val="0"/>
-          <w:sz w:val="20"/>
-        </w:rPr>
-        <w:t>Quarkus, Vue 3, PostgreSQL, Keycloak, Multi-tenant</w:t>
-      </w:r>
-    </w:p>
-    <w:p>
-      <w:r>
-        <w:rPr>
-          <w:rFonts w:ascii="Calibri" w:hAnsi="Calibri"/>
-          <w:b/>
-          <w:sz w:val="22"/>
-        </w:rPr>
         <w:t>Pedalons (https://pedalons.fr)</w:t>
       </w:r>
     </w:p>
@@ -1199,7 +1169,7 @@
           <w:b w:val="0"/>
           <w:sz w:val="22"/>
         </w:rPr>
-        <w:t>Plateforme communautaire pour organiser des sorties cyclistes et partager des routes GPX</w:t>
+        <w:t>Plateforme SaaS multi-tenant pour clubs cyclistes : gestion d'inscriptions, résultats, planning, sorties et partage de routes GPX</w:t>
       </w:r>
     </w:p>
     <w:p>
@@ -1209,7 +1179,7 @@
           <w:b w:val="0"/>
           <w:sz w:val="20"/>
         </w:rPr>
-        <w:t>MapLibre, GPX, PMTiles, Tippecanoe, Vue 3</w:t>
+        <w:t>Quarkus, Vue 3, PostgreSQL, Keycloak, Multi-tenant, MapLibre, GPX, PMTiles</w:t>
       </w:r>
     </w:p>
     <w:p>

</xml_diff>

<commit_message>
data: merge validation électronique into brevets.bike project
</commit_message>
<xml_diff>
--- a/docs/downloads/Gabriel_Landais_CV_FR.docx
+++ b/docs/downloads/Gabriel_Landais_CV_FR.docx
@@ -1199,7 +1199,7 @@
           <w:b w:val="0"/>
           <w:sz w:val="22"/>
         </w:rPr>
-        <w:t>Analyse de tracés GPS pour la gamification de la grande randonnée cycliste (brevets ACP)</w:t>
+        <w:t>Analyse de tracés GPS et validation électronique pour épreuves de grande randonnée cycliste et ultra-cyclisme (brevets ACP)</w:t>
       </w:r>
     </w:p>
     <w:p>
@@ -1209,37 +1209,7 @@
           <w:b w:val="0"/>
           <w:sz w:val="20"/>
         </w:rPr>
-        <w:t>Python, numpy, Flask, MongoDB, Kafka, Docker</w:t>
-      </w:r>
-    </w:p>
-    <w:p>
-      <w:r>
-        <w:rPr>
-          <w:rFonts w:ascii="Calibri" w:hAnsi="Calibri"/>
-          <w:b/>
-          <w:sz w:val="22"/>
-        </w:rPr>
-        <w:t>Validation électronique d'épreuves cyclistes longue distance</w:t>
-      </w:r>
-    </w:p>
-    <w:p>
-      <w:r>
-        <w:rPr>
-          <w:rFonts w:ascii="Calibri" w:hAnsi="Calibri"/>
-          <w:b w:val="0"/>
-          <w:sz w:val="22"/>
-        </w:rPr>
-        <w:t>Système de validation électronique pour épreuves d'ultra-cyclisme</w:t>
-      </w:r>
-    </w:p>
-    <w:p>
-      <w:r>
-        <w:rPr>
-          <w:rFonts w:ascii="Calibri" w:hAnsi="Calibri"/>
-          <w:b w:val="0"/>
-          <w:sz w:val="20"/>
-        </w:rPr>
-        <w:t>GPS, cyclisme, validation</w:t>
+        <w:t>Python, numpy, Flask, MongoDB, Kafka, Docker, GPS</w:t>
       </w:r>
     </w:p>
     <w:p>

</xml_diff>